<commit_message>
Swap in the rebuilt .docx, so the graded artifact matches its source again
The previous commit landed the markdown for section 3.4's fourth error but not the .docx,
because Word held an exclusive lock on it. That left the graded artifact one section behind
its source, which the commit message said plainly rather than leaving someone to discover.
Word is closed and the rebuilt file is now in place.

Verified after the swap rather than assumed from the build log: 262 paragraphs, 19 tables,
6 images all within the 6.00in usable page width, section 3.4 reading "Four errors worth
reporting", the train_model finding present, and zero PENDING markers.

Also removed the ~$ lock file Word leaves behind. It is gitignored so it was never going to
be committed, but leaving it on disk tells the next reader the document is checked out by
somebody who has since closed it.

All three graded artifacts are now current with the repository: this .docx, the pushed
GitHub repo, and the deployed prototype.
</commit_message>
<xml_diff>
--- a/docs/submission/solution-walkthrough.docx
+++ b/docs/submission/solution-walkthrough.docx
@@ -2626,7 +2626,7 @@
         <w:pStyle w:val="Heading3"/>
       </w:pPr>
       <w:r>
-        <w:t>3.4 Three errors worth reporting</w:t>
+        <w:t>3.4 Four errors worth reporting</w:t>
       </w:r>
     </w:p>
     <w:p>
@@ -2732,7 +2732,149 @@
     </w:p>
     <w:p>
       <w:r>
-        <w:t>That is the pattern in all three errors. Each was caught by asking what the number was measured *under* rather than whether it looked plausible. None of them would have been caught by a number that looked wrong, because in every case the number looked entirely reasonable.</w:t>
+        <w:rPr>
+          <w:b/>
+        </w:rPr>
+        <w:t>The fourth error is the one careful reading would not have found.</w:t>
+      </w:r>
+    </w:p>
+    <w:p>
+      <w:r>
+        <w:rPr>
+          <w:rFonts w:ascii="Consolas" w:hAnsi="Consolas"/>
+          <w:sz w:val="20"/>
+        </w:rPr>
+        <w:t>loop/flows.py</w:t>
+      </w:r>
+      <w:r>
+        <w:t xml:space="preserve"> built its detector like this:</w:t>
+      </w:r>
+    </w:p>
+    <w:p>
+      <w:pPr>
+        <w:ind w:left="360"/>
+      </w:pPr>
+      <w:r>
+        <w:rPr>
+          <w:rFonts w:ascii="Consolas" w:hAnsi="Consolas"/>
+          <w:sz w:val="18"/>
+        </w:rPr>
+        <w:t>try:</w:t>
+        <w:br/>
+        <w:t xml:space="preserve">    from ..detect.train import train_model</w:t>
+        <w:br/>
+        <w:t xml:space="preserve">    return train_model(train_df)</w:t>
+        <w:br/>
+        <w:t>except Exception:</w:t>
+        <w:br/>
+        <w:t xml:space="preserve">    pass                     # fall through to the configuration below</w:t>
+      </w:r>
+    </w:p>
+    <w:p>
+      <w:r>
+        <w:rPr>
+          <w:rFonts w:ascii="Consolas" w:hAnsi="Consolas"/>
+          <w:sz w:val="20"/>
+        </w:rPr>
+        <w:t>train_model</w:t>
+      </w:r>
+      <w:r>
+        <w:t xml:space="preserve"> does not exist. That module exports </w:t>
+      </w:r>
+      <w:r>
+        <w:rPr>
+          <w:rFonts w:ascii="Consolas" w:hAnsi="Consolas"/>
+          <w:sz w:val="20"/>
+        </w:rPr>
+        <w:t>train_round</w:t>
+      </w:r>
+      <w:r>
+        <w:t>. So the import raised on every call, the fallback ran every time, and it ran that way for the life of the project.</w:t>
+      </w:r>
+    </w:p>
+    <w:p>
+      <w:r>
+        <w:t xml:space="preserve">Nothing was broken and no published number is wrong. What was wrong is that </w:t>
+      </w:r>
+      <w:r>
+        <w:rPr>
+          <w:b/>
+        </w:rPr>
+        <w:t>the source could not tell you which model produced the results.</w:t>
+      </w:r>
+      <w:r>
+        <w:t xml:space="preserve"> A reader following that code would conclude the rounds in </w:t>
+      </w:r>
+      <w:r>
+        <w:rPr>
+          <w:rFonts w:ascii="Consolas" w:hAnsi="Consolas"/>
+          <w:sz w:val="20"/>
+        </w:rPr>
+        <w:t>artifacts/detect/rounds.json</w:t>
+      </w:r>
+      <w:r>
+        <w:t xml:space="preserve"> came from </w:t>
+      </w:r>
+      <w:r>
+        <w:rPr>
+          <w:rFonts w:ascii="Consolas" w:hAnsi="Consolas"/>
+          <w:sz w:val="20"/>
+        </w:rPr>
+        <w:t>detect/train.py</w:t>
+      </w:r>
+      <w:r>
+        <w:t xml:space="preserve"> at 400 estimators, depth 7, learning rate 0.08. They came from 300, depth 6, 0.1. Both are real configurations in real files that a maintained project would legitimately contain; only the absence of one function definition separates the live one from the dead one.</w:t>
+      </w:r>
+    </w:p>
+    <w:p>
+      <w:r>
+        <w:t xml:space="preserve">It was caught because a second person, drafting section 3.5, went to cite the detector's hyperparameters and read them out of </w:t>
+      </w:r>
+      <w:r>
+        <w:rPr>
+          <w:rFonts w:ascii="Consolas" w:hAnsi="Consolas"/>
+          <w:sz w:val="20"/>
+        </w:rPr>
+        <w:t>detect/train.py</w:t>
+      </w:r>
+      <w:r>
+        <w:t xml:space="preserve"> — the file the code appeared to prefer. Confirming which one actually ran took a single command, </w:t>
+      </w:r>
+      <w:r>
+        <w:rPr>
+          <w:rFonts w:ascii="Consolas" w:hAnsi="Consolas"/>
+          <w:sz w:val="20"/>
+        </w:rPr>
+        <w:t>grep -c "^def train_model"</w:t>
+      </w:r>
+      <w:r>
+        <w:t>, returning zero. Nobody reading either file carefully would have found it, because neither file is wrong. The disagreement lives in the space between them.</w:t>
+      </w:r>
+    </w:p>
+    <w:p>
+      <w:r>
+        <w:t xml:space="preserve">The </w:t>
+      </w:r>
+      <w:r>
+        <w:rPr>
+          <w:rFonts w:ascii="Consolas" w:hAnsi="Consolas"/>
+          <w:sz w:val="20"/>
+        </w:rPr>
+        <w:t>try/except</w:t>
+      </w:r>
+      <w:r>
+        <w:t xml:space="preserve"> is what let it persist: an exception handler that catches everything and continues cannot distinguish "this dependency is temporarily unavailable" from "this function was never written." It reports success either way. The branch is now deleted and the live configuration sits inline.</w:t>
+      </w:r>
+    </w:p>
+    <w:p>
+      <w:r>
+        <w:rPr>
+          <w:b/>
+        </w:rPr>
+        <w:t>The pattern across the first three is one thing; the fourth is another, and both are worth carrying away.</w:t>
+      </w:r>
+      <w:r>
+        <w:t xml:space="preserve"> The first three were each caught by asking what a number was measured *under* rather than whether it looked plausible — none would have been caught by a number that looked wrong, because in every case the number looked entirely reasonable. The fourth would not have been caught by that question either. It needed someone to ask which code actually ran, and to check rather than read. In a codebase where failures are swallowed, that is a question you have to ask deliberately, because nothing will ever raise it for you.</w:t>
       </w:r>
     </w:p>
     <w:p>

</xml_diff>